<commit_message>
Add notification mute controls
</commit_message>
<xml_diff>
--- a/Инструкция работа с ботом контроля workpace.docx
+++ b/Инструкция работа с ботом контроля workpace.docx
@@ -1,8 +1,8 @@
 
 <file path=word/document.xml><?xml version="1.0" encoding="utf-8"?>
-<w:document xmlns:wpc="http://schemas.microsoft.com/office/word/2010/wordprocessingCanvas" xmlns:cx="http://schemas.microsoft.com/office/drawing/2014/chartex" xmlns:cx1="http://schemas.microsoft.com/office/drawing/2015/9/8/chartex" xmlns:cx2="http://schemas.microsoft.com/office/drawing/2015/10/21/chartex" xmlns:cx3="http://schemas.microsoft.com/office/drawing/2016/5/9/chartex" xmlns:cx4="http://schemas.microsoft.com/office/drawing/2016/5/10/chartex" xmlns:cx5="http://schemas.microsoft.com/office/drawing/2016/5/11/chartex" xmlns:cx6="http://schemas.microsoft.com/office/drawing/2016/5/12/chartex" xmlns:cx7="http://schemas.microsoft.com/office/drawing/2016/5/13/chartex" xmlns:cx8="http://schemas.microsoft.com/office/drawing/2016/5/14/chartex" xmlns:mc="http://schemas.openxmlformats.org/markup-compatibility/2006" xmlns:aink="http://schemas.microsoft.com/office/drawing/2016/ink" xmlns:am3d="http://schemas.microsoft.com/office/drawing/2017/model3d" xmlns:o="urn:schemas-microsoft-com:office:office" xmlns:r="http://schemas.openxmlformats.org/officeDocument/2006/relationships" xmlns:m="http://schemas.openxmlformats.org/officeDocument/2006/math" xmlns:v="urn:schemas-microsoft-com:vml" xmlns:wp14="http://schemas.microsoft.com/office/word/2010/wordprocessingDrawing" xmlns:wp="http://schemas.openxmlformats.org/drawingml/2006/wordprocessingDrawing" xmlns:w10="urn:schemas-microsoft-com:office:word" xmlns:w="http://schemas.openxmlformats.org/wordprocessingml/2006/main" xmlns:w14="http://schemas.microsoft.com/office/word/2010/wordml" xmlns:w15="http://schemas.microsoft.com/office/word/2012/wordml" xmlns:w16cid="http://schemas.microsoft.com/office/word/2016/wordml/cid" xmlns:w16se="http://schemas.microsoft.com/office/word/2015/wordml/symex" xmlns:wpg="http://schemas.microsoft.com/office/word/2010/wordprocessingGroup" xmlns:wpi="http://schemas.microsoft.com/office/word/2010/wordprocessingInk" xmlns:wne="http://schemas.microsoft.com/office/word/2006/wordml" xmlns:wps="http://schemas.microsoft.com/office/word/2010/wordprocessingShape" mc:Ignorable="w14 w15 w16se w16cid wp14">
+<w:document xmlns:ns1="http://schemas.openxmlformats.org/markup-compatibility/2006" xmlns:ns2="http://schemas.microsoft.com/office/word/2010/wordml" xmlns:ns3="urn:schemas-microsoft-com:vml" xmlns:ns4="urn:schemas-microsoft-com:office:office" xmlns:w="http://schemas.openxmlformats.org/wordprocessingml/2006/main" ns1:Ignorable="w14 w15 w16se w16cid wp14">
   <w:body>
-    <w:p>
+    <w:p ns2:paraId="1B98E41C" ns2:textId="77777777">
       <w:pPr>
         <w:shd w:val="clear" w:color="auto" w:fill="FFFFFF"/>
         <w:spacing w:before="100" w:beforeAutospacing="1" w:after="240" w:line="240" w:lineRule="auto"/>
@@ -103,7 +103,7 @@
       </w:r>
       <w:proofErr w:type="spellEnd"/>
     </w:p>
-    <w:p>
+    <w:p ns2:paraId="5373D96B" ns2:textId="77777777">
       <w:pPr>
         <w:shd w:val="clear" w:color="auto" w:fill="FFFFFF"/>
         <w:spacing w:after="240" w:line="240" w:lineRule="auto"/>
@@ -248,7 +248,7 @@
         <w:t>.</w:t>
       </w:r>
     </w:p>
-    <w:p>
+    <w:p ns2:paraId="1E68B025" ns2:textId="77777777">
       <w:pPr>
         <w:shd w:val="clear" w:color="auto" w:fill="FFFFFF"/>
         <w:spacing w:after="240" w:line="240" w:lineRule="auto"/>
@@ -271,7 +271,7 @@
         <w:t>Данное руководство содержит описание ключевых функций системы, структуры формируемых отчетов и правил использования доступных команд для руководителей подразделений и ответственных сотрудников.</w:t>
       </w:r>
     </w:p>
-    <w:p>
+    <w:p ns2:paraId="313A3FDA" ns2:textId="77777777">
       <w:pPr>
         <w:spacing w:before="360" w:after="360" w:line="240" w:lineRule="auto"/>
         <w:rPr>
@@ -288,12 +288,12 @@
           <w:szCs w:val="24"/>
           <w:lang w:eastAsia="ru-RU"/>
         </w:rPr>
-        <w:pict w14:anchorId="3851EFAA">
-          <v:rect id="_x0000_i1034" style="width:0;height:3pt" o:hralign="center" o:hrstd="t" o:hr="t" fillcolor="#a0a0a0" stroked="f"/>
+        <w:pict ns2:anchorId="3851EFAA">
+          <ns3:rect id="_x0000_i1034" style="width:0;height:3pt" ns4:hralign="center" ns4:hrstd="t" ns4:hr="t" fillcolor="#a0a0a0" stroked="f"/>
         </w:pict>
       </w:r>
     </w:p>
-    <w:p>
+    <w:p ns2:paraId="22B061D1" ns2:textId="77777777">
       <w:pPr>
         <w:shd w:val="clear" w:color="auto" w:fill="FFFFFF"/>
         <w:spacing w:before="360" w:after="240" w:line="240" w:lineRule="auto"/>
@@ -321,7 +321,7 @@
         <w:t>Основные функциональные возможности системы</w:t>
       </w:r>
     </w:p>
-    <w:p>
+    <w:p ns2:paraId="63A55DAC" ns2:textId="77777777">
       <w:pPr>
         <w:shd w:val="clear" w:color="auto" w:fill="FFFFFF"/>
         <w:spacing w:before="360" w:after="240" w:line="240" w:lineRule="auto"/>
@@ -349,7 +349,7 @@
         <w:t>1. Оперативный мониторинг нарушений трудовой дисциплины</w:t>
       </w:r>
     </w:p>
-    <w:p>
+    <w:p ns2:paraId="5A078C04" ns2:textId="77777777">
       <w:pPr>
         <w:shd w:val="clear" w:color="auto" w:fill="FFFFFF"/>
         <w:spacing w:after="240" w:line="240" w:lineRule="auto"/>
@@ -394,7 +394,7 @@
         <w:t xml:space="preserve"> направляются соответствующие уведомления:</w:t>
       </w:r>
     </w:p>
-    <w:p>
+    <w:p ns2:paraId="6E934AF2" ns2:textId="77777777">
       <w:pPr>
         <w:numPr>
           <w:ilvl w:val="0"/>
@@ -457,7 +457,7 @@
         <w:t xml:space="preserve"> в случае, если первая отметка о приходе на рабочее место осуществлена позже времени начала плановой смены (с учетом заданного допустимого порога, установленного в настройках системы).</w:t>
       </w:r>
     </w:p>
-    <w:p>
+    <w:p ns2:paraId="23AF096C" ns2:textId="77777777">
       <w:pPr>
         <w:numPr>
           <w:ilvl w:val="0"/>
@@ -520,7 +520,7 @@
         <w:t xml:space="preserve"> при регистрации отметки о выходе ранее запланированного времени окончания смены.</w:t>
       </w:r>
     </w:p>
-    <w:p>
+    <w:p ns2:paraId="0D09301B" ns2:textId="77777777">
       <w:pPr>
         <w:numPr>
           <w:ilvl w:val="0"/>
@@ -583,7 +583,7 @@
         <w:t xml:space="preserve"> в случае отсутствия отметки о приходе сотрудника в течение 10 минут после планового начала его смены.</w:t>
       </w:r>
     </w:p>
-    <w:p>
+    <w:p ns2:paraId="3487344E" ns2:textId="77777777">
       <w:pPr>
         <w:numPr>
           <w:ilvl w:val="0"/>
@@ -646,7 +646,7 @@
         <w:t xml:space="preserve"> в случае отсутствия регистрации отметки о выходе в течение 10 минут после планового окончания смены.</w:t>
       </w:r>
     </w:p>
-    <w:p>
+    <w:p ns2:paraId="41EE6C87" ns2:textId="77777777">
       <w:pPr>
         <w:numPr>
           <w:ilvl w:val="0"/>
@@ -709,7 +709,7 @@
         <w:t>, если биометрическая отметка сотрудника помечена системой как недостоверная (например, подозрение на использование фотографии или необходимость ручной модерации). Уведомление содержит информацию об устройстве и точном времени регистрации.</w:t>
       </w:r>
     </w:p>
-    <w:p>
+    <w:p ns2:paraId="72C648DD" ns2:textId="77777777">
       <w:pPr>
         <w:shd w:val="clear" w:color="auto" w:fill="FFFFFF"/>
         <w:spacing w:before="360" w:after="240" w:line="240" w:lineRule="auto"/>
@@ -738,7 +738,7 @@
         <w:t>2. Координация действий менеджеров (Кнопка «Отбито»)</w:t>
       </w:r>
     </w:p>
-    <w:p>
+    <w:p ns2:paraId="3BE62D9D" ns2:textId="77777777">
       <w:pPr>
         <w:shd w:val="clear" w:color="auto" w:fill="FFFFFF"/>
         <w:spacing w:after="240" w:line="240" w:lineRule="auto"/>
@@ -783,7 +783,7 @@
         <w:t>:</w:t>
       </w:r>
     </w:p>
-    <w:p>
+    <w:p ns2:paraId="0870A619" ns2:textId="77777777">
       <w:pPr>
         <w:numPr>
           <w:ilvl w:val="0"/>
@@ -810,7 +810,7 @@
         <w:t>Ответственный менеджер, обработавший инцидент (выяснивший причину отсутствия или опоздания сотрудника), нажимает кнопку «Отбито».</w:t>
       </w:r>
     </w:p>
-    <w:p>
+    <w:p ns2:paraId="64A0BA30" ns2:textId="77777777">
       <w:pPr>
         <w:numPr>
           <w:ilvl w:val="0"/>
@@ -837,7 +837,7 @@
         <w:t>Сообщение мгновенно обновляется: в нем фиксируется ФИО менеджера, принявшего задачу, и точное время отметки.</w:t>
       </w:r>
     </w:p>
-    <w:p>
+    <w:p ns2:paraId="0513AA9E" ns2:textId="77777777">
       <w:pPr>
         <w:numPr>
           <w:ilvl w:val="0"/>
@@ -880,6 +880,110 @@
         </w:rPr>
       </w:pPr>
       <w:r>
+        <w:t>3. Управление отключением отбивок по сотрудникам и отделам</w:t>
+      </w:r>
+    </w:p>
+    <w:p>
+      <w:pPr>
+        <w:shd w:val="clear" w:color="auto" w:fill="FFFFFF"/>
+        <w:spacing w:after="240" w:line="240" w:lineRule="auto"/>
+        <w:rPr>
+          <w:rFonts w:ascii="Segoe UI" w:eastAsia="Times New Roman" w:hAnsi="Segoe UI" w:cs="Segoe UI"/>
+          <w:color w:val="1F2328"/>
+          <w:sz w:val="24"/>
+          <w:szCs w:val="24"/>
+          <w:lang w:eastAsia="ru-RU"/>
+        </w:rPr>
+      </w:pPr>
+      <w:r>
+        <w:t>Администратор может временно отключать оперативные отбивки для конкретного сотрудника или целого отдела. Это полезно для отпусков, командировок, тестовых учетных записей и других случаев, когда автоматические уведомления не должны попадать в рабочие чаты.</w:t>
+      </w:r>
+    </w:p>
+    <w:p>
+      <w:pPr>
+        <w:numPr>
+          <w:ilvl w:val="0"/>
+          <w:numId w:val="7"/>
+        </w:numPr>
+        <w:shd w:val="clear" w:color="auto" w:fill="FFFFFF"/>
+        <w:spacing w:before="100" w:beforeAutospacing="1" w:after="100" w:afterAutospacing="1" w:line="240" w:lineRule="auto"/>
+        <w:rPr>
+          <w:rFonts w:ascii="Segoe UI" w:eastAsia="Times New Roman" w:hAnsi="Segoe UI" w:cs="Segoe UI"/>
+          <w:color w:val="1F2328"/>
+          <w:sz w:val="24"/>
+          <w:szCs w:val="24"/>
+          <w:lang w:eastAsia="ru-RU"/>
+        </w:rPr>
+      </w:pPr>
+      <w:r>
+        <w:t>Отключение применяется к оперативным уведомлениям об опозданиях, ранних уходах, неявках и подозрительных биометрических отметках.</w:t>
+      </w:r>
+    </w:p>
+    <w:p>
+      <w:pPr>
+        <w:numPr>
+          <w:ilvl w:val="0"/>
+          <w:numId w:val="7"/>
+        </w:numPr>
+        <w:shd w:val="clear" w:color="auto" w:fill="FFFFFF"/>
+        <w:spacing w:before="100" w:beforeAutospacing="1" w:after="100" w:afterAutospacing="1" w:line="240" w:lineRule="auto"/>
+        <w:rPr>
+          <w:rFonts w:ascii="Segoe UI" w:eastAsia="Times New Roman" w:hAnsi="Segoe UI" w:cs="Segoe UI"/>
+          <w:color w:val="1F2328"/>
+          <w:sz w:val="24"/>
+          <w:szCs w:val="24"/>
+          <w:lang w:eastAsia="ru-RU"/>
+        </w:rPr>
+      </w:pPr>
+      <w:r>
+        <w:t>Фильтр работает по ФИО сотрудника и названию отдела, поэтому можно отключить как одного человека, так и весь контур подразделения.</w:t>
+      </w:r>
+    </w:p>
+    <w:p>
+      <w:pPr>
+        <w:numPr>
+          <w:ilvl w:val="0"/>
+          <w:numId w:val="7"/>
+        </w:numPr>
+        <w:shd w:val="clear" w:color="auto" w:fill="FFFFFF"/>
+        <w:spacing w:before="100" w:beforeAutospacing="1" w:after="100" w:afterAutospacing="1" w:line="240" w:lineRule="auto"/>
+        <w:rPr>
+          <w:rFonts w:ascii="Segoe UI" w:eastAsia="Times New Roman" w:hAnsi="Segoe UI" w:cs="Segoe UI"/>
+          <w:color w:val="1F2328"/>
+          <w:sz w:val="24"/>
+          <w:szCs w:val="24"/>
+          <w:lang w:eastAsia="ru-RU"/>
+        </w:rPr>
+      </w:pPr>
+      <w:r>
+        <w:t>Список отключений сохраняется в файле mutes.json и автоматически загружается после перезапуска сервиса.</w:t>
+      </w:r>
+    </w:p>
+    <w:p>
+      <w:pPr>
+        <w:numPr>
+          <w:ilvl w:val="0"/>
+          <w:numId w:val="7"/>
+        </w:numPr>
+        <w:shd w:val="clear" w:color="auto" w:fill="FFFFFF"/>
+        <w:spacing w:before="100" w:beforeAutospacing="1" w:after="100" w:afterAutospacing="1" w:line="240" w:lineRule="auto"/>
+        <w:rPr>
+          <w:rFonts w:ascii="Segoe UI" w:eastAsia="Times New Roman" w:hAnsi="Segoe UI" w:cs="Segoe UI"/>
+          <w:color w:val="1F2328"/>
+          <w:sz w:val="24"/>
+          <w:szCs w:val="24"/>
+          <w:lang w:eastAsia="ru-RU"/>
+        </w:rPr>
+      </w:pPr>
+      <w:r>
+        <w:t>Администратор может в любой момент посмотреть текущие отключения командой /muted и вернуть уведомления обратно командами /unmute_user или /unmute_dept.</w:t>
+      </w:r>
+    </w:p>
+    <w:p ns2:paraId="5E852771" ns2:textId="77777777">
+      <w:pPr>
+        <w:shd w:val="clear" w:color="auto" w:fill="FFFFFF"/>
+        <w:spacing w:before="360" w:after="240" w:line="240" w:lineRule="auto"/>
+        <w:outlineLvl w:val="2"/>
         <w:rPr>
           <w:rFonts w:ascii="Segoe UI" w:eastAsia="Times New Roman" w:hAnsi="Segoe UI" w:cs="Segoe UI"/>
           <w:b/>
@@ -889,57 +993,45 @@
           <w:szCs w:val="30"/>
           <w:lang w:eastAsia="ru-RU"/>
         </w:rPr>
-        <w:t xml:space="preserve">3. Автоматизированная отчетность в формате </w:t>
+      </w:pPr>
+      <w:r>
+        <w:t>4. Автоматизированная отчетность в формате Excel</w:t>
+      </w:r>
+    </w:p>
+    <w:p ns2:paraId="35471529" ns2:textId="77777777">
+      <w:pPr>
+        <w:shd w:val="clear" w:color="auto" w:fill="FFFFFF"/>
+        <w:spacing w:after="240" w:line="240" w:lineRule="auto"/>
+        <w:rPr>
+          <w:rFonts w:ascii="Segoe UI" w:eastAsia="Times New Roman" w:hAnsi="Segoe UI" w:cs="Segoe UI"/>
+          <w:color w:val="1F2328"/>
+          <w:sz w:val="24"/>
+          <w:szCs w:val="24"/>
+          <w:lang w:eastAsia="ru-RU"/>
+        </w:rPr>
+      </w:pPr>
+      <w:r>
+        <w:rPr>
+          <w:rFonts w:ascii="Segoe UI" w:eastAsia="Times New Roman" w:hAnsi="Segoe UI" w:cs="Segoe UI"/>
+          <w:color w:val="1F2328"/>
+          <w:sz w:val="24"/>
+          <w:szCs w:val="24"/>
+          <w:lang w:eastAsia="ru-RU"/>
+        </w:rPr>
+        <w:t xml:space="preserve">По запросу система генерирует структурированную аналитическую таблицу в формате </w:t>
       </w:r>
       <w:proofErr w:type="spellStart"/>
       <w:r>
         <w:rPr>
           <w:rFonts w:ascii="Segoe UI" w:eastAsia="Times New Roman" w:hAnsi="Segoe UI" w:cs="Segoe UI"/>
-          <w:b/>
-          <w:bCs/>
-          <w:color w:val="1F2328"/>
-          <w:sz w:val="30"/>
-          <w:szCs w:val="30"/>
+          <w:color w:val="1F2328"/>
+          <w:sz w:val="24"/>
+          <w:szCs w:val="24"/>
           <w:lang w:eastAsia="ru-RU"/>
         </w:rPr>
         <w:t>Excel</w:t>
       </w:r>
       <w:proofErr w:type="spellEnd"/>
-    </w:p>
-    <w:p>
-      <w:pPr>
-        <w:shd w:val="clear" w:color="auto" w:fill="FFFFFF"/>
-        <w:spacing w:after="240" w:line="240" w:lineRule="auto"/>
-        <w:rPr>
-          <w:rFonts w:ascii="Segoe UI" w:eastAsia="Times New Roman" w:hAnsi="Segoe UI" w:cs="Segoe UI"/>
-          <w:color w:val="1F2328"/>
-          <w:sz w:val="24"/>
-          <w:szCs w:val="24"/>
-          <w:lang w:eastAsia="ru-RU"/>
-        </w:rPr>
-      </w:pPr>
-      <w:r>
-        <w:rPr>
-          <w:rFonts w:ascii="Segoe UI" w:eastAsia="Times New Roman" w:hAnsi="Segoe UI" w:cs="Segoe UI"/>
-          <w:color w:val="1F2328"/>
-          <w:sz w:val="24"/>
-          <w:szCs w:val="24"/>
-          <w:lang w:eastAsia="ru-RU"/>
-        </w:rPr>
-        <w:t xml:space="preserve">По запросу система генерирует структурированную аналитическую таблицу в формате </w:t>
-      </w:r>
-      <w:proofErr w:type="spellStart"/>
-      <w:r>
-        <w:rPr>
-          <w:rFonts w:ascii="Segoe UI" w:eastAsia="Times New Roman" w:hAnsi="Segoe UI" w:cs="Segoe UI"/>
-          <w:color w:val="1F2328"/>
-          <w:sz w:val="24"/>
-          <w:szCs w:val="24"/>
-          <w:lang w:eastAsia="ru-RU"/>
-        </w:rPr>
-        <w:t>Excel</w:t>
-      </w:r>
-      <w:proofErr w:type="spellEnd"/>
       <w:r>
         <w:rPr>
           <w:rFonts w:ascii="Segoe UI" w:eastAsia="Times New Roman" w:hAnsi="Segoe UI" w:cs="Segoe UI"/>
@@ -951,7 +1043,7 @@
         <w:t>. Документ оформлен в деловом корпоративном стиле и включает следующие параметры:</w:t>
       </w:r>
     </w:p>
-    <w:p>
+    <w:p ns2:paraId="03038A15" ns2:textId="77777777">
       <w:pPr>
         <w:numPr>
           <w:ilvl w:val="0"/>
@@ -990,7 +1082,7 @@
         <w:t> — закрепленное подразделение сотрудника.</w:t>
       </w:r>
     </w:p>
-    <w:p>
+    <w:p ns2:paraId="39D50658" ns2:textId="77777777">
       <w:pPr>
         <w:numPr>
           <w:ilvl w:val="0"/>
@@ -1029,7 +1121,7 @@
         <w:t> — персональные данные сотрудника.</w:t>
       </w:r>
     </w:p>
-    <w:p>
+    <w:p ns2:paraId="3C613916" ns2:textId="77777777">
       <w:pPr>
         <w:numPr>
           <w:ilvl w:val="0"/>
@@ -1068,7 +1160,7 @@
         <w:t> — наименование назначенного рабочего расписания.</w:t>
       </w:r>
     </w:p>
-    <w:p>
+    <w:p ns2:paraId="78D7C6AC" ns2:textId="77777777">
       <w:pPr>
         <w:numPr>
           <w:ilvl w:val="0"/>
@@ -1107,7 +1199,7 @@
         <w:t> — полная хронологическая последовательность всех приходов и уходов за текущие сутки. Подозрительные отметки помечаются специальным символом предупреждения.</w:t>
       </w:r>
     </w:p>
-    <w:p>
+    <w:p ns2:paraId="08EDB1D8" ns2:textId="77777777">
       <w:pPr>
         <w:numPr>
           <w:ilvl w:val="0"/>
@@ -1146,7 +1238,7 @@
         <w:t> — плановое начало рабочего дня.</w:t>
       </w:r>
     </w:p>
-    <w:p>
+    <w:p ns2:paraId="21CC5A9A" ns2:textId="77777777">
       <w:pPr>
         <w:numPr>
           <w:ilvl w:val="0"/>
@@ -1185,7 +1277,7 @@
         <w:t> — фактически зафиксированное время первого прихода.</w:t>
       </w:r>
     </w:p>
-    <w:p>
+    <w:p ns2:paraId="37BC8316" ns2:textId="77777777">
       <w:pPr>
         <w:numPr>
           <w:ilvl w:val="0"/>
@@ -1224,7 +1316,7 @@
         <w:t> — количество минут опоздания относительно плана (при раннем приходе выводится прочерк).</w:t>
       </w:r>
     </w:p>
-    <w:p>
+    <w:p ns2:paraId="55FDC539" ns2:textId="77777777">
       <w:pPr>
         <w:numPr>
           <w:ilvl w:val="0"/>
@@ -1263,7 +1355,7 @@
         <w:t> — плановое окончание рабочего дня.</w:t>
       </w:r>
     </w:p>
-    <w:p>
+    <w:p ns2:paraId="0383FA92" ns2:textId="77777777">
       <w:pPr>
         <w:numPr>
           <w:ilvl w:val="0"/>
@@ -1302,7 +1394,7 @@
         <w:t> — фактически зафиксированное время последнего выхода.</w:t>
       </w:r>
     </w:p>
-    <w:p>
+    <w:p ns2:paraId="793064DD" ns2:textId="77777777">
       <w:pPr>
         <w:numPr>
           <w:ilvl w:val="0"/>
@@ -1341,7 +1433,7 @@
         <w:t> — количество минут отсутствия до планового окончания смены.</w:t>
       </w:r>
     </w:p>
-    <w:p>
+    <w:p ns2:paraId="509A6A78" ns2:textId="77777777">
       <w:pPr>
         <w:numPr>
           <w:ilvl w:val="0"/>
@@ -1380,7 +1472,7 @@
         <w:t> — фактическая продолжительность нахождения сотрудника на рабочем месте (интервал между самым ранним входом и самым поздним выходом за день).</w:t>
       </w:r>
     </w:p>
-    <w:p>
+    <w:p ns2:paraId="4EF364EB" ns2:textId="77777777">
       <w:pPr>
         <w:numPr>
           <w:ilvl w:val="0"/>
@@ -1419,7 +1511,7 @@
         <w:t> — разница между фактическим временем работы и установленной нормой смены (значение со знаком «+» означает переработку, со знаком «-» — недоработку).</w:t>
       </w:r>
     </w:p>
-    <w:p>
+    <w:p ns2:paraId="6A7377B7" ns2:textId="77777777">
       <w:pPr>
         <w:numPr>
           <w:ilvl w:val="0"/>
@@ -1458,7 +1550,7 @@
         <w:t> — итоговая оценка посещаемости с цветовой индикацией:</w:t>
       </w:r>
     </w:p>
-    <w:p>
+    <w:p ns2:paraId="6AC49A58" ns2:textId="77777777">
       <w:pPr>
         <w:numPr>
           <w:ilvl w:val="1"/>
@@ -1497,7 +1589,7 @@
         <w:t> (светло-зеленый фон) — соответствие графику.</w:t>
       </w:r>
     </w:p>
-    <w:p>
+    <w:p ns2:paraId="13620D45" ns2:textId="77777777">
       <w:pPr>
         <w:numPr>
           <w:ilvl w:val="1"/>
@@ -1537,7 +1629,7 @@
         <w:t> (светло-красный фон) — зафиксированы нарушения.</w:t>
       </w:r>
     </w:p>
-    <w:p>
+    <w:p ns2:paraId="33A3C7BD" ns2:textId="77777777">
       <w:pPr>
         <w:numPr>
           <w:ilvl w:val="1"/>
@@ -1598,7 +1690,7 @@
         <w:t> (светло-желтый фон) — работа в выходной день или наличие отметок, требующих подтверждения.</w:t>
       </w:r>
     </w:p>
-    <w:p>
+    <w:p ns2:paraId="2D3275ED" ns2:textId="77777777">
       <w:pPr>
         <w:spacing w:before="360" w:after="360" w:line="240" w:lineRule="auto"/>
         <w:rPr>
@@ -1615,12 +1707,12 @@
           <w:szCs w:val="24"/>
           <w:lang w:eastAsia="ru-RU"/>
         </w:rPr>
-        <w:pict w14:anchorId="3A640EC5">
-          <v:rect id="_x0000_i1035" style="width:0;height:3pt" o:hralign="center" o:hrstd="t" o:hr="t" fillcolor="#a0a0a0" stroked="f"/>
+        <w:pict ns2:anchorId="3A640EC5">
+          <ns3:rect id="_x0000_i1035" style="width:0;height:3pt" ns4:hralign="center" ns4:hrstd="t" ns4:hr="t" fillcolor="#a0a0a0" stroked="f"/>
         </w:pict>
       </w:r>
     </w:p>
-    <w:p>
+    <w:p ns2:paraId="03E2DDE4" ns2:textId="77777777">
       <w:pPr>
         <w:shd w:val="clear" w:color="auto" w:fill="FFFFFF"/>
         <w:spacing w:before="360" w:after="240" w:line="240" w:lineRule="auto"/>
@@ -1648,7 +1740,7 @@
         <w:t>Архитектура отчетов за период (Сводные отчеты)</w:t>
       </w:r>
     </w:p>
-    <w:p>
+    <w:p ns2:paraId="316730AC" ns2:textId="77777777">
       <w:pPr>
         <w:shd w:val="clear" w:color="auto" w:fill="FFFFFF"/>
         <w:spacing w:after="240" w:line="240" w:lineRule="auto"/>
@@ -1693,7 +1785,7 @@
         <w:t xml:space="preserve"> с разделением на следующие логические разделы:</w:t>
       </w:r>
     </w:p>
-    <w:p>
+    <w:p ns2:paraId="5EC2FCD7" ns2:textId="77777777">
       <w:pPr>
         <w:numPr>
           <w:ilvl w:val="0"/>
@@ -1758,7 +1850,7 @@
         <w:t> Содержит консолидированные показатели эффективности за весь выбранный период для каждого сотрудника:</w:t>
       </w:r>
     </w:p>
-    <w:p>
+    <w:p ns2:paraId="796AB372" ns2:textId="77777777">
       <w:pPr>
         <w:numPr>
           <w:ilvl w:val="1"/>
@@ -1785,7 +1877,7 @@
         <w:t>Общее количество дней по графику (план выходов).</w:t>
       </w:r>
     </w:p>
-    <w:p>
+    <w:p ns2:paraId="0D731979" ns2:textId="77777777">
       <w:pPr>
         <w:numPr>
           <w:ilvl w:val="1"/>
@@ -1812,7 +1904,7 @@
         <w:t>Фактическое число отработанных дней.</w:t>
       </w:r>
     </w:p>
-    <w:p>
+    <w:p ns2:paraId="13A4F094" ns2:textId="77777777">
       <w:pPr>
         <w:numPr>
           <w:ilvl w:val="1"/>
@@ -1839,7 +1931,7 @@
         <w:t>Количество дней, отработанных полностью без нарушений графика.</w:t>
       </w:r>
     </w:p>
-    <w:p>
+    <w:p ns2:paraId="39AE2B64" ns2:textId="77777777">
       <w:pPr>
         <w:numPr>
           <w:ilvl w:val="1"/>
@@ -1866,7 +1958,7 @@
         <w:t>Количество и суммарное время всех зафиксированных опозданий.</w:t>
       </w:r>
     </w:p>
-    <w:p>
+    <w:p ns2:paraId="69C37C0F" ns2:textId="77777777">
       <w:pPr>
         <w:numPr>
           <w:ilvl w:val="1"/>
@@ -1893,7 +1985,7 @@
         <w:t>Количество и суммарное время всех ранних уходов.</w:t>
       </w:r>
     </w:p>
-    <w:p>
+    <w:p ns2:paraId="0B7B3866" ns2:textId="77777777">
       <w:pPr>
         <w:numPr>
           <w:ilvl w:val="1"/>
@@ -1920,7 +2012,7 @@
         <w:t>Общее количество неявок (прогулов).</w:t>
       </w:r>
     </w:p>
-    <w:p>
+    <w:p ns2:paraId="112F5894" ns2:textId="77777777">
       <w:pPr>
         <w:numPr>
           <w:ilvl w:val="1"/>
@@ -1947,7 +2039,7 @@
         <w:t>Суммарно отработанное время за период.</w:t>
       </w:r>
     </w:p>
-    <w:p>
+    <w:p ns2:paraId="6065F018" ns2:textId="77777777">
       <w:pPr>
         <w:numPr>
           <w:ilvl w:val="1"/>
@@ -1974,7 +2066,7 @@
         <w:t>Среднее рабочее время за один рабочий день.</w:t>
       </w:r>
     </w:p>
-    <w:p>
+    <w:p ns2:paraId="41B8A9C0" ns2:textId="77777777">
       <w:pPr>
         <w:numPr>
           <w:ilvl w:val="0"/>
@@ -2013,7 +2105,7 @@
         <w:t> Каждый день периода выносится на отдельную вкладку, названную соответствующей датой. Вкладка содержит подробную суточную таблицу со всеми отметками и расчетами, отфильтрованную по выбранным параметрам.</w:t>
       </w:r>
     </w:p>
-    <w:p>
+    <w:p ns2:paraId="64550D34" ns2:textId="77777777">
       <w:pPr>
         <w:spacing w:before="360" w:after="360" w:line="240" w:lineRule="auto"/>
         <w:rPr>
@@ -2030,12 +2122,12 @@
           <w:szCs w:val="24"/>
           <w:lang w:eastAsia="ru-RU"/>
         </w:rPr>
-        <w:pict w14:anchorId="2B977662">
-          <v:rect id="_x0000_i1036" style="width:0;height:3pt" o:hralign="center" o:hrstd="t" o:hr="t" fillcolor="#a0a0a0" stroked="f"/>
+        <w:pict ns2:anchorId="2B977662">
+          <ns3:rect id="_x0000_i1036" style="width:0;height:3pt" ns4:hralign="center" ns4:hrstd="t" ns4:hr="t" fillcolor="#a0a0a0" stroked="f"/>
         </w:pict>
       </w:r>
     </w:p>
-    <w:p>
+    <w:p ns2:paraId="2DE877A8" ns2:textId="77777777">
       <w:pPr>
         <w:shd w:val="clear" w:color="auto" w:fill="FFFFFF"/>
         <w:spacing w:before="360" w:after="240" w:line="240" w:lineRule="auto"/>
@@ -2063,7 +2155,7 @@
         <w:t>Оптимизация и защита данных</w:t>
       </w:r>
     </w:p>
-    <w:p>
+    <w:p ns2:paraId="4A4333DC" ns2:textId="77777777">
       <w:pPr>
         <w:shd w:val="clear" w:color="auto" w:fill="FFFFFF"/>
         <w:spacing w:after="240" w:line="240" w:lineRule="auto"/>
@@ -2086,7 +2178,7 @@
         <w:t>В систему встроены интеллектуальные модули для повышения точности учета и стабильности работы:</w:t>
       </w:r>
     </w:p>
-    <w:p>
+    <w:p ns2:paraId="0F2951DF" ns2:textId="77777777">
       <w:pPr>
         <w:numPr>
           <w:ilvl w:val="0"/>
@@ -2193,7 +2285,7 @@
         <w:t xml:space="preserve"> отметок на входе и восстанавливает реальное время прихода, предотвращая ложные уведомления об отсутствии.</w:t>
       </w:r>
     </w:p>
-    <w:p>
+    <w:p ns2:paraId="3F368E69" ns2:textId="77777777">
       <w:pPr>
         <w:numPr>
           <w:ilvl w:val="0"/>
@@ -2237,6 +2329,26 @@
       <w:pPr>
         <w:numPr>
           <w:ilvl w:val="0"/>
+          <w:numId w:val="7"/>
+        </w:numPr>
+        <w:shd w:val="clear" w:color="auto" w:fill="FFFFFF"/>
+        <w:spacing w:before="100" w:beforeAutospacing="1" w:after="100" w:afterAutospacing="1" w:line="240" w:lineRule="auto"/>
+        <w:rPr>
+          <w:rFonts w:ascii="Segoe UI" w:eastAsia="Times New Roman" w:hAnsi="Segoe UI" w:cs="Segoe UI"/>
+          <w:color w:val="1F2328"/>
+          <w:sz w:val="24"/>
+          <w:szCs w:val="24"/>
+          <w:lang w:eastAsia="ru-RU"/>
+        </w:rPr>
+      </w:pPr>
+      <w:r>
+        <w:t>Гибкое отключение отбивок: Администраторы могут временно исключать отдельных сотрудников или отделы из оперативной рассылки без изменения расписаний и отчетной логики.</w:t>
+      </w:r>
+    </w:p>
+    <w:p ns2:paraId="2B02270A" ns2:textId="77777777">
+      <w:pPr>
+        <w:numPr>
+          <w:ilvl w:val="0"/>
           <w:numId w:val="10"/>
         </w:numPr>
         <w:shd w:val="clear" w:color="auto" w:fill="FFFFFF"/>
@@ -2294,7 +2406,7 @@
         <w:t>.</w:t>
       </w:r>
     </w:p>
-    <w:p>
+    <w:p ns2:paraId="0CA07CC2" ns2:textId="77777777">
       <w:pPr>
         <w:spacing w:before="360" w:after="360" w:line="240" w:lineRule="auto"/>
         <w:rPr>
@@ -2311,12 +2423,12 @@
           <w:szCs w:val="24"/>
           <w:lang w:eastAsia="ru-RU"/>
         </w:rPr>
-        <w:pict w14:anchorId="6CA546C5">
-          <v:rect id="_x0000_i1037" style="width:0;height:3pt" o:hralign="center" o:hrstd="t" o:hr="t" fillcolor="#a0a0a0" stroked="f"/>
+        <w:pict ns2:anchorId="6CA546C5">
+          <ns3:rect id="_x0000_i1037" style="width:0;height:3pt" ns4:hralign="center" ns4:hrstd="t" ns4:hr="t" fillcolor="#a0a0a0" stroked="f"/>
         </w:pict>
       </w:r>
     </w:p>
-    <w:p>
+    <w:p ns2:paraId="03DED4F4" ns2:textId="77777777">
       <w:pPr>
         <w:shd w:val="clear" w:color="auto" w:fill="FFFFFF"/>
         <w:spacing w:before="360" w:after="240" w:line="240" w:lineRule="auto"/>
@@ -2358,7 +2470,7 @@
       </w:r>
       <w:proofErr w:type="spellEnd"/>
     </w:p>
-    <w:p>
+    <w:p ns2:paraId="169C4A24" ns2:textId="77777777">
       <w:pPr>
         <w:numPr>
           <w:ilvl w:val="0"/>
@@ -2429,7 +2541,7 @@
         <w:t xml:space="preserve"> ID) и краткого перечня функций.</w:t>
       </w:r>
     </w:p>
-    <w:p>
+    <w:p ns2:paraId="04D51515" ns2:textId="77777777">
       <w:pPr>
         <w:numPr>
           <w:ilvl w:val="0"/>
@@ -2522,7 +2634,7 @@
         <w:t> по всем подразделениям компании.</w:t>
       </w:r>
     </w:p>
-    <w:p>
+    <w:p ns2:paraId="7D967D79" ns2:textId="77777777">
       <w:pPr>
         <w:numPr>
           <w:ilvl w:val="0"/>
@@ -2645,7 +2757,7 @@
         <w:t>).</w:t>
       </w:r>
     </w:p>
-    <w:p>
+    <w:p ns2:paraId="115889AA" ns2:textId="77777777">
       <w:pPr>
         <w:numPr>
           <w:ilvl w:val="0"/>
@@ -2768,7 +2880,7 @@
         <w:t>).</w:t>
       </w:r>
     </w:p>
-    <w:p>
+    <w:p ns2:paraId="0CA5F83B" ns2:textId="77777777">
       <w:pPr>
         <w:numPr>
           <w:ilvl w:val="0"/>
@@ -2869,7 +2981,7 @@
         <w:t>).</w:t>
       </w:r>
     </w:p>
-    <w:p>
+    <w:p ns2:paraId="5630AF1F" ns2:textId="77777777">
       <w:pPr>
         <w:numPr>
           <w:ilvl w:val="0"/>
@@ -3004,7 +3116,7 @@
         <w:t>).</w:t>
       </w:r>
     </w:p>
-    <w:p>
+    <w:p ns2:paraId="24BB213D" ns2:textId="77777777">
       <w:pPr>
         <w:numPr>
           <w:ilvl w:val="0"/>
@@ -3149,7 +3261,7 @@
         <w:t>).</w:t>
       </w:r>
     </w:p>
-    <w:p>
+    <w:p ns2:paraId="39F6E6FE" ns2:textId="77777777">
       <w:pPr>
         <w:numPr>
           <w:ilvl w:val="0"/>
@@ -3252,7 +3364,7 @@
         <w:t> Подключение нового чата в контур автоматической рассылки уведомлений о нарушениях.</w:t>
       </w:r>
     </w:p>
-    <w:p>
+    <w:p ns2:paraId="50088334" ns2:textId="77777777">
       <w:pPr>
         <w:numPr>
           <w:ilvl w:val="0"/>
@@ -3355,7 +3467,7 @@
         <w:t> Отключение чата от контура автоматической рассылки.</w:t>
       </w:r>
     </w:p>
-    <w:p>
+    <w:p ns2:paraId="719E2F10" ns2:textId="77777777">
       <w:pPr>
         <w:numPr>
           <w:ilvl w:val="0"/>
@@ -3427,6 +3539,106 @@
       </w:r>
     </w:p>
     <w:p>
+      <w:pPr>
+        <w:numPr>
+          <w:ilvl w:val="0"/>
+          <w:numId w:val="11"/>
+        </w:numPr>
+        <w:shd w:val="clear" w:color="auto" w:fill="FFFFFF"/>
+        <w:spacing w:after="0" w:afterAutospacing="1" w:line="240" w:lineRule="auto"/>
+        <w:rPr>
+          <w:rFonts w:ascii="Segoe UI" w:eastAsia="Times New Roman" w:hAnsi="Segoe UI" w:cs="Segoe UI"/>
+          <w:color w:val="1F2328"/>
+          <w:sz w:val="24"/>
+          <w:szCs w:val="24"/>
+          <w:lang w:eastAsia="ru-RU"/>
+        </w:rPr>
+      </w:pPr>
+      <w:r>
+        <w:t>/mute_user [ФИО] — (Доступно администраторам) Временное отключение оперативных отбивок по конкретному сотруднику.</w:t>
+      </w:r>
+    </w:p>
+    <w:p>
+      <w:pPr>
+        <w:numPr>
+          <w:ilvl w:val="0"/>
+          <w:numId w:val="11"/>
+        </w:numPr>
+        <w:shd w:val="clear" w:color="auto" w:fill="FFFFFF"/>
+        <w:spacing w:after="0" w:afterAutospacing="1" w:line="240" w:lineRule="auto"/>
+        <w:rPr>
+          <w:rFonts w:ascii="Segoe UI" w:eastAsia="Times New Roman" w:hAnsi="Segoe UI" w:cs="Segoe UI"/>
+          <w:color w:val="1F2328"/>
+          <w:sz w:val="24"/>
+          <w:szCs w:val="24"/>
+          <w:lang w:eastAsia="ru-RU"/>
+        </w:rPr>
+      </w:pPr>
+      <w:r>
+        <w:t>/unmute_user [ФИО] — (Доступно администраторам) Повторное включение оперативных отбивок по сотруднику.</w:t>
+      </w:r>
+    </w:p>
+    <w:p>
+      <w:pPr>
+        <w:numPr>
+          <w:ilvl w:val="0"/>
+          <w:numId w:val="11"/>
+        </w:numPr>
+        <w:shd w:val="clear" w:color="auto" w:fill="FFFFFF"/>
+        <w:spacing w:after="0" w:afterAutospacing="1" w:line="240" w:lineRule="auto"/>
+        <w:rPr>
+          <w:rFonts w:ascii="Segoe UI" w:eastAsia="Times New Roman" w:hAnsi="Segoe UI" w:cs="Segoe UI"/>
+          <w:color w:val="1F2328"/>
+          <w:sz w:val="24"/>
+          <w:szCs w:val="24"/>
+          <w:lang w:eastAsia="ru-RU"/>
+        </w:rPr>
+      </w:pPr>
+      <w:r>
+        <w:t>/mute_dept [Название Отдела] — (Доступно администраторам) Временное отключение оперативных отбивок по всему отделу.</w:t>
+      </w:r>
+    </w:p>
+    <w:p>
+      <w:pPr>
+        <w:numPr>
+          <w:ilvl w:val="0"/>
+          <w:numId w:val="11"/>
+        </w:numPr>
+        <w:shd w:val="clear" w:color="auto" w:fill="FFFFFF"/>
+        <w:spacing w:after="0" w:afterAutospacing="1" w:line="240" w:lineRule="auto"/>
+        <w:rPr>
+          <w:rFonts w:ascii="Segoe UI" w:eastAsia="Times New Roman" w:hAnsi="Segoe UI" w:cs="Segoe UI"/>
+          <w:color w:val="1F2328"/>
+          <w:sz w:val="24"/>
+          <w:szCs w:val="24"/>
+          <w:lang w:eastAsia="ru-RU"/>
+        </w:rPr>
+      </w:pPr>
+      <w:r>
+        <w:t>/unmute_dept [Название Отдела] — (Доступно администраторам) Повторное включение оперативных отбивок по отделу.</w:t>
+      </w:r>
+    </w:p>
+    <w:p>
+      <w:pPr>
+        <w:numPr>
+          <w:ilvl w:val="0"/>
+          <w:numId w:val="11"/>
+        </w:numPr>
+        <w:shd w:val="clear" w:color="auto" w:fill="FFFFFF"/>
+        <w:spacing w:after="0" w:afterAutospacing="1" w:line="240" w:lineRule="auto"/>
+        <w:rPr>
+          <w:rFonts w:ascii="Segoe UI" w:eastAsia="Times New Roman" w:hAnsi="Segoe UI" w:cs="Segoe UI"/>
+          <w:color w:val="1F2328"/>
+          <w:sz w:val="24"/>
+          <w:szCs w:val="24"/>
+          <w:lang w:eastAsia="ru-RU"/>
+        </w:rPr>
+      </w:pPr>
+      <w:r>
+        <w:t>/muted — (Доступно администраторам) Просмотр списка сотрудников и отделов, для которых отбивки временно отключены.</w:t>
+      </w:r>
+    </w:p>
+    <w:p ns2:paraId="22724727" ns2:textId="77777777">
       <w:bookmarkStart w:id="0" w:name="_GoBack"/>
       <w:bookmarkEnd w:id="0"/>
     </w:p>

</xml_diff>

<commit_message>
Allow personal notification mutes
</commit_message>
<xml_diff>
--- a/Инструкция работа с ботом контроля workpace.docx
+++ b/Инструкция работа с ботом контроля workpace.docx
@@ -880,7 +880,7 @@
         </w:rPr>
       </w:pPr>
       <w:r>
-        <w:t>3. Управление отключением отбивок по сотрудникам и отделам</w:t>
+        <w:t>3. Персональное и глобальное отключение отбивок</w:t>
       </w:r>
     </w:p>
     <w:p>
@@ -896,7 +896,7 @@
         </w:rPr>
       </w:pPr>
       <w:r>
-        <w:t>Администратор может временно отключать оперативные отбивки для конкретного сотрудника или целого отдела. Это полезно для отпусков, командировок, тестовых учетных записей и других случаев, когда автоматические уведомления не должны попадать в рабочие чаты.</w:t>
+        <w:t>Пользователи могут временно отключать оперативные отбивки для конкретного сотрудника или целого отдела в своем личном чате с ботом. Администратор может применять те же команды глобально для всех чатов рассылки.</w:t>
       </w:r>
     </w:p>
     <w:p>
@@ -936,7 +936,7 @@
         </w:rPr>
       </w:pPr>
       <w:r>
-        <w:t>Фильтр работает по ФИО сотрудника и названию отдела, поэтому можно отключить как одного человека, так и весь контур подразделения.</w:t>
+        <w:t>Фильтр работает по ФИО сотрудника и названию отдела, поэтому пользователь может отключить как одного человека, так и весь контур подразделения.</w:t>
       </w:r>
     </w:p>
     <w:p>
@@ -956,7 +956,7 @@
         </w:rPr>
       </w:pPr>
       <w:r>
-        <w:t>Список отключений сохраняется в файле mutes.json и автоматически загружается после перезапуска сервиса.</w:t>
+        <w:t>Персональные настройки привязаны к chat_id и сохраняются в файле mutes.json, который автоматически загружается после перезапуска сервиса.</w:t>
       </w:r>
     </w:p>
     <w:p>
@@ -976,7 +976,7 @@
         </w:rPr>
       </w:pPr>
       <w:r>
-        <w:t>Администратор может в любой момент посмотреть текущие отключения командой /muted и вернуть уведомления обратно командами /unmute_user или /unmute_dept.</w:t>
+        <w:t>Пользователь может в любой момент посмотреть свои отключения командой /muted и вернуть уведомления обратно командами /unmute_user или /unmute_dept. В групповых чатах персонально скрыть сообщение от одного участника невозможно, поэтому обычные пользователи настраивают mute в личном чате с ботом.</w:t>
       </w:r>
     </w:p>
     <w:p ns2:paraId="5E852771" ns2:textId="77777777">
@@ -2342,7 +2342,7 @@
         </w:rPr>
       </w:pPr>
       <w:r>
-        <w:t>Гибкое отключение отбивок: Администраторы могут временно исключать отдельных сотрудников или отделы из оперативной рассылки без изменения расписаний и отчетной логики.</w:t>
+        <w:t>Гибкое отключение отбивок: Пользователи могут персонально отключать уведомления по отдельным сотрудникам или отделам, а администратор может применять такие исключения глобально без изменения расписаний и отчетной логики.</w:t>
       </w:r>
     </w:p>
     <w:p ns2:paraId="2B02270A" ns2:textId="77777777">
@@ -3555,7 +3555,7 @@
         </w:rPr>
       </w:pPr>
       <w:r>
-        <w:t>/mute_user [ФИО] — (Доступно администраторам) Временное отключение оперативных отбивок по конкретному сотруднику.</w:t>
+        <w:t>/mute_user [ФИО] — Временное отключение оперативных отбивок по конкретному сотруднику для текущего пользователя.</w:t>
       </w:r>
     </w:p>
     <w:p>
@@ -3575,7 +3575,7 @@
         </w:rPr>
       </w:pPr>
       <w:r>
-        <w:t>/unmute_user [ФИО] — (Доступно администраторам) Повторное включение оперативных отбивок по сотруднику.</w:t>
+        <w:t>/unmute_user [ФИО] — Повторное включение оперативных отбивок по сотруднику для текущего пользователя.</w:t>
       </w:r>
     </w:p>
     <w:p>
@@ -3595,7 +3595,7 @@
         </w:rPr>
       </w:pPr>
       <w:r>
-        <w:t>/mute_dept [Название Отдела] — (Доступно администраторам) Временное отключение оперативных отбивок по всему отделу.</w:t>
+        <w:t>/mute_dept [Название Отдела] — Временное отключение оперативных отбивок по всему отделу для текущего пользователя.</w:t>
       </w:r>
     </w:p>
     <w:p>
@@ -3615,7 +3615,7 @@
         </w:rPr>
       </w:pPr>
       <w:r>
-        <w:t>/unmute_dept [Название Отдела] — (Доступно администраторам) Повторное включение оперативных отбивок по отделу.</w:t>
+        <w:t>/unmute_dept [Название Отдела] — Повторное включение оперативных отбивок по отделу для текущего пользователя.</w:t>
       </w:r>
     </w:p>
     <w:p>
@@ -3635,7 +3635,7 @@
         </w:rPr>
       </w:pPr>
       <w:r>
-        <w:t>/muted — (Доступно администраторам) Просмотр списка сотрудников и отделов, для которых отбивки временно отключены.</w:t>
+        <w:t>/muted — Просмотр списка сотрудников и отделов, для которых отбивки временно отключены.</w:t>
       </w:r>
     </w:p>
     <w:p ns2:paraId="22724727" ns2:textId="77777777">

</xml_diff>